<commit_message>
Project guide: add RBI/banking domain-knowledge Q&A group
</commit_message>
<xml_diff>
--- a/docs/Grounded_Project_Bible.docx
+++ b/docs/Grounded_Project_Bible.docx
@@ -14967,6 +14967,583 @@
           <w:b w:val="0"/>
         </w:rPr>
         <w:t>If I change the embedding model I must re-embed the whole corpus so queries and chunks share one space. If regulations change, I re-index the new PDFs. The CI gate and golden set catch quality regressions from either.</w:t>
+      </w:r>
+    </w:p>
+    <w:p>
+      <w:pPr>
+        <w:spacing w:after="40"/>
+      </w:pPr>
+    </w:p>
+    <w:p>
+      <w:r>
+        <w:rPr>
+          <w:b/>
+          <w:color w:val="1565C0"/>
+          <w:sz w:val="30"/>
+        </w:rPr>
+        <w:t>O · Domain knowledge (RBI, banking &amp; the corpus)</w:t>
+      </w:r>
+    </w:p>
+    <w:p>
+      <w:r>
+        <w:rPr>
+          <w:b w:val="0"/>
+          <w:sz w:val="22"/>
+        </w:rPr>
+        <w:t>These check that you understand the DATA and DOMAIN, not just the ML. You don't need to be a compliance expert — just show you know what your own documents contain and why the domain fits the system.</w:t>
+      </w:r>
+    </w:p>
+    <w:tbl>
+      <w:tblPr>
+        <w:tblW w:type="auto" w:w="0"/>
+        <w:tblLook w:firstColumn="1" w:firstRow="1" w:lastColumn="0" w:lastRow="0" w:noHBand="0" w:noVBand="1" w:val="04A0"/>
+      </w:tblPr>
+      <w:tblGrid>
+        <w:gridCol w:w="8640"/>
+      </w:tblGrid>
+      <w:tr>
+        <w:tc>
+          <w:tcPr>
+            <w:tcW w:type="dxa" w:w="8640"/>
+            <w:shd w:val="clear" w:color="auto" w:fill="E8F0FE"/>
+          </w:tcPr>
+          <w:p>
+            <w:r>
+              <w:rPr>
+                <w:b/>
+                <w:color w:val="1565C0"/>
+                <w:sz w:val="22"/>
+              </w:rPr>
+              <w:t xml:space="preserve">Q79. </w:t>
+            </w:r>
+            <w:r>
+              <w:rPr>
+                <w:b/>
+                <w:color w:val="12143A"/>
+              </w:rPr>
+              <w:t>What is the RBI, and what are 'Master Directions'?</w:t>
+            </w:r>
+          </w:p>
+        </w:tc>
+      </w:tr>
+    </w:tbl>
+    <w:p>
+      <w:r>
+        <w:rPr>
+          <w:b/>
+          <w:color w:val="2E7D32"/>
+        </w:rPr>
+        <w:t xml:space="preserve">A. </w:t>
+      </w:r>
+      <w:r>
+        <w:rPr>
+          <w:b w:val="0"/>
+        </w:rPr>
+        <w:t>The RBI — Reserve Bank of India — is India's central bank and the main regulator for banks and NBFCs. 'Master Directions' are its consolidated, authoritative rulebooks on a topic (e.g. KYC, digital lending): living documents the RBI updates over time. They're exactly the kind of dense, authoritative text a compliance team must answer questions against.</w:t>
+      </w:r>
+    </w:p>
+    <w:p>
+      <w:pPr>
+        <w:spacing w:after="40"/>
+      </w:pPr>
+    </w:p>
+    <w:tbl>
+      <w:tblPr>
+        <w:tblW w:type="auto" w:w="0"/>
+        <w:tblLook w:firstColumn="1" w:firstRow="1" w:lastColumn="0" w:lastRow="0" w:noHBand="0" w:noVBand="1" w:val="04A0"/>
+      </w:tblPr>
+      <w:tblGrid>
+        <w:gridCol w:w="8640"/>
+      </w:tblGrid>
+      <w:tr>
+        <w:tc>
+          <w:tcPr>
+            <w:tcW w:type="dxa" w:w="8640"/>
+            <w:shd w:val="clear" w:color="auto" w:fill="E8F0FE"/>
+          </w:tcPr>
+          <w:p>
+            <w:r>
+              <w:rPr>
+                <w:b/>
+                <w:color w:val="1565C0"/>
+                <w:sz w:val="22"/>
+              </w:rPr>
+              <w:t xml:space="preserve">Q80. </w:t>
+            </w:r>
+            <w:r>
+              <w:rPr>
+                <w:b/>
+                <w:color w:val="12143A"/>
+              </w:rPr>
+              <w:t>What is an NBFC, and why does it appear in your corpus?</w:t>
+            </w:r>
+          </w:p>
+        </w:tc>
+      </w:tr>
+    </w:tbl>
+    <w:p>
+      <w:r>
+        <w:rPr>
+          <w:b/>
+          <w:color w:val="2E7D32"/>
+        </w:rPr>
+        <w:t xml:space="preserve">A. </w:t>
+      </w:r>
+      <w:r>
+        <w:rPr>
+          <w:b w:val="0"/>
+        </w:rPr>
+        <w:t>An NBFC is a Non-Banking Financial Company — it lends and provides financial services but isn't a full bank (e.g. can't take demand deposits). RBI regulates them too. My corpus includes the NBFC Scale-Based Regulation because a lot of lending and customer-protection rules apply specifically to NBFCs.</w:t>
+      </w:r>
+    </w:p>
+    <w:p>
+      <w:pPr>
+        <w:spacing w:after="40"/>
+      </w:pPr>
+    </w:p>
+    <w:tbl>
+      <w:tblPr>
+        <w:tblW w:type="auto" w:w="0"/>
+        <w:tblLook w:firstColumn="1" w:firstRow="1" w:lastColumn="0" w:lastRow="0" w:noHBand="0" w:noVBand="1" w:val="04A0"/>
+      </w:tblPr>
+      <w:tblGrid>
+        <w:gridCol w:w="8640"/>
+      </w:tblGrid>
+      <w:tr>
+        <w:tc>
+          <w:tcPr>
+            <w:tcW w:type="dxa" w:w="8640"/>
+            <w:shd w:val="clear" w:color="auto" w:fill="E8F0FE"/>
+          </w:tcPr>
+          <w:p>
+            <w:r>
+              <w:rPr>
+                <w:b/>
+                <w:color w:val="1565C0"/>
+                <w:sz w:val="22"/>
+              </w:rPr>
+              <w:t xml:space="preserve">Q81. </w:t>
+            </w:r>
+            <w:r>
+              <w:rPr>
+                <w:b/>
+                <w:color w:val="12143A"/>
+              </w:rPr>
+              <w:t>What are the 10 documents in your corpus?</w:t>
+            </w:r>
+          </w:p>
+        </w:tc>
+      </w:tr>
+    </w:tbl>
+    <w:p>
+      <w:r>
+        <w:rPr>
+          <w:b/>
+          <w:color w:val="2E7D32"/>
+        </w:rPr>
+        <w:t xml:space="preserve">A. </w:t>
+      </w:r>
+      <w:r>
+        <w:rPr>
+          <w:b w:val="0"/>
+        </w:rPr>
+        <w:t>They're themed around lending, credit and customer protection: KYC Master Direction, Digital Lending Directions, NBFC Scale-Based Regulation, Credit/Debit Card Directions, Microfinance Framework, Interest Rate on Advances, Priority Sector Lending, Fraud Risk Management, Customer Service Master Circular, and Outsourcing of Financial Services. Together: 720 pages of real, cross-referencing regulation.</w:t>
+      </w:r>
+    </w:p>
+    <w:p>
+      <w:pPr>
+        <w:spacing w:after="40"/>
+      </w:pPr>
+    </w:p>
+    <w:tbl>
+      <w:tblPr>
+        <w:tblW w:type="auto" w:w="0"/>
+        <w:tblLook w:firstColumn="1" w:firstRow="1" w:lastColumn="0" w:lastRow="0" w:noHBand="0" w:noVBand="1" w:val="04A0"/>
+      </w:tblPr>
+      <w:tblGrid>
+        <w:gridCol w:w="8640"/>
+      </w:tblGrid>
+      <w:tr>
+        <w:tc>
+          <w:tcPr>
+            <w:tcW w:type="dxa" w:w="8640"/>
+            <w:shd w:val="clear" w:color="auto" w:fill="E8F0FE"/>
+          </w:tcPr>
+          <w:p>
+            <w:r>
+              <w:rPr>
+                <w:b/>
+                <w:color w:val="1565C0"/>
+                <w:sz w:val="22"/>
+              </w:rPr>
+              <w:t xml:space="preserve">Q82. </w:t>
+            </w:r>
+            <w:r>
+              <w:rPr>
+                <w:b/>
+                <w:color w:val="12143A"/>
+              </w:rPr>
+              <w:t>What is KYC, and what's a question your system answers about it?</w:t>
+            </w:r>
+          </w:p>
+        </w:tc>
+      </w:tr>
+    </w:tbl>
+    <w:p>
+      <w:r>
+        <w:rPr>
+          <w:b/>
+          <w:color w:val="2E7D32"/>
+        </w:rPr>
+        <w:t xml:space="preserve">A. </w:t>
+      </w:r>
+      <w:r>
+        <w:rPr>
+          <w:b w:val="0"/>
+        </w:rPr>
+        <w:t>KYC = 'Know Your Customer' — the rules banks follow to verify who a customer is, to prevent fraud and money laundering. A real question my system handles is the beneficial-owner threshold for a trust — it retrieves the exact KYC Master Direction page and cites it.</w:t>
+      </w:r>
+    </w:p>
+    <w:p>
+      <w:pPr>
+        <w:spacing w:after="40"/>
+      </w:pPr>
+    </w:p>
+    <w:tbl>
+      <w:tblPr>
+        <w:tblW w:type="auto" w:w="0"/>
+        <w:tblLook w:firstColumn="1" w:firstRow="1" w:lastColumn="0" w:lastRow="0" w:noHBand="0" w:noVBand="1" w:val="04A0"/>
+      </w:tblPr>
+      <w:tblGrid>
+        <w:gridCol w:w="8640"/>
+      </w:tblGrid>
+      <w:tr>
+        <w:tc>
+          <w:tcPr>
+            <w:tcW w:type="dxa" w:w="8640"/>
+            <w:shd w:val="clear" w:color="auto" w:fill="E8F0FE"/>
+          </w:tcPr>
+          <w:p>
+            <w:r>
+              <w:rPr>
+                <w:b/>
+                <w:color w:val="1565C0"/>
+                <w:sz w:val="22"/>
+              </w:rPr>
+              <w:t xml:space="preserve">Q83. </w:t>
+            </w:r>
+            <w:r>
+              <w:rPr>
+                <w:b/>
+                <w:color w:val="12143A"/>
+              </w:rPr>
+              <w:t>What is the KFS (Key Fact Statement) — your headline demo question?</w:t>
+            </w:r>
+          </w:p>
+        </w:tc>
+      </w:tr>
+    </w:tbl>
+    <w:p>
+      <w:r>
+        <w:rPr>
+          <w:b/>
+          <w:color w:val="2E7D32"/>
+        </w:rPr>
+        <w:t xml:space="preserve">A. </w:t>
+      </w:r>
+      <w:r>
+        <w:rPr>
+          <w:b w:val="0"/>
+        </w:rPr>
+        <w:t>The Key Fact Statement is a standardised summary a lender must give a borrower up front — showing the true cost of the loan (interest, fees, penal charges) in a clear format, so borrowers can compare and aren't misled. My demo asks what a digital lending app must disclose via the KFS, and the system answers citing the Digital Lending Directions, page 8.</w:t>
+      </w:r>
+    </w:p>
+    <w:p>
+      <w:r>
+        <w:rPr>
+          <w:b/>
+          <w:i/>
+          <w:sz w:val="20"/>
+        </w:rPr>
+        <w:t>💡 Say this too:</w:t>
+      </w:r>
+      <w:r>
+        <w:rPr>
+          <w:b w:val="0"/>
+          <w:i/>
+          <w:sz w:val="20"/>
+        </w:rPr>
+        <w:t xml:space="preserve"> This is your best live example — know it cold, since it's the one you demo.</w:t>
+      </w:r>
+    </w:p>
+    <w:p>
+      <w:pPr>
+        <w:spacing w:after="40"/>
+      </w:pPr>
+    </w:p>
+    <w:tbl>
+      <w:tblPr>
+        <w:tblW w:type="auto" w:w="0"/>
+        <w:tblLook w:firstColumn="1" w:firstRow="1" w:lastColumn="0" w:lastRow="0" w:noHBand="0" w:noVBand="1" w:val="04A0"/>
+      </w:tblPr>
+      <w:tblGrid>
+        <w:gridCol w:w="8640"/>
+      </w:tblGrid>
+      <w:tr>
+        <w:tc>
+          <w:tcPr>
+            <w:tcW w:type="dxa" w:w="8640"/>
+            <w:shd w:val="clear" w:color="auto" w:fill="E8F0FE"/>
+          </w:tcPr>
+          <w:p>
+            <w:r>
+              <w:rPr>
+                <w:b/>
+                <w:color w:val="1565C0"/>
+                <w:sz w:val="22"/>
+              </w:rPr>
+              <w:t xml:space="preserve">Q84. </w:t>
+            </w:r>
+            <w:r>
+              <w:rPr>
+                <w:b/>
+                <w:color w:val="12143A"/>
+              </w:rPr>
+              <w:t>What is Priority Sector Lending (PSL)?</w:t>
+            </w:r>
+          </w:p>
+        </w:tc>
+      </w:tr>
+    </w:tbl>
+    <w:p>
+      <w:r>
+        <w:rPr>
+          <w:b/>
+          <w:color w:val="2E7D32"/>
+        </w:rPr>
+        <w:t xml:space="preserve">A. </w:t>
+      </w:r>
+      <w:r>
+        <w:rPr>
+          <w:b w:val="0"/>
+        </w:rPr>
+        <w:t>PSL is an RBI rule that banks must lend a minimum share of their credit to priority sectors like agriculture, small businesses, and weaker sections — often expressed as a percentage of ANBC (Adjusted Net Bank Credit). It's one of my corpus topics and one of the golden-set questions.</w:t>
+      </w:r>
+    </w:p>
+    <w:p>
+      <w:pPr>
+        <w:spacing w:after="40"/>
+      </w:pPr>
+    </w:p>
+    <w:tbl>
+      <w:tblPr>
+        <w:tblW w:type="auto" w:w="0"/>
+        <w:tblLook w:firstColumn="1" w:firstRow="1" w:lastColumn="0" w:lastRow="0" w:noHBand="0" w:noVBand="1" w:val="04A0"/>
+      </w:tblPr>
+      <w:tblGrid>
+        <w:gridCol w:w="8640"/>
+      </w:tblGrid>
+      <w:tr>
+        <w:tc>
+          <w:tcPr>
+            <w:tcW w:type="dxa" w:w="8640"/>
+            <w:shd w:val="clear" w:color="auto" w:fill="E8F0FE"/>
+          </w:tcPr>
+          <w:p>
+            <w:r>
+              <w:rPr>
+                <w:b/>
+                <w:color w:val="1565C0"/>
+                <w:sz w:val="22"/>
+              </w:rPr>
+              <w:t xml:space="preserve">Q85. </w:t>
+            </w:r>
+            <w:r>
+              <w:rPr>
+                <w:b/>
+                <w:color w:val="12143A"/>
+              </w:rPr>
+              <w:t>Why is banking compliance a good fit for a citation-and-refusal RAG system?</w:t>
+            </w:r>
+          </w:p>
+        </w:tc>
+      </w:tr>
+    </w:tbl>
+    <w:p>
+      <w:r>
+        <w:rPr>
+          <w:b/>
+          <w:color w:val="2E7D32"/>
+        </w:rPr>
+        <w:t xml:space="preserve">A. </w:t>
+      </w:r>
+      <w:r>
+        <w:rPr>
+          <w:b w:val="0"/>
+        </w:rPr>
+        <w:t>Because in compliance, being traceable and being right matter more than being fluent. Every answer may end up in an audit file, so citations are essential; and a confidently wrong answer creates regulatory and reputational risk, so refusing when unsure is a feature, not a weakness. The domain rewards exactly the behaviours I built.</w:t>
+      </w:r>
+    </w:p>
+    <w:p>
+      <w:pPr>
+        <w:spacing w:after="40"/>
+      </w:pPr>
+    </w:p>
+    <w:tbl>
+      <w:tblPr>
+        <w:tblW w:type="auto" w:w="0"/>
+        <w:tblLook w:firstColumn="1" w:firstRow="1" w:lastColumn="0" w:lastRow="0" w:noHBand="0" w:noVBand="1" w:val="04A0"/>
+      </w:tblPr>
+      <w:tblGrid>
+        <w:gridCol w:w="8640"/>
+      </w:tblGrid>
+      <w:tr>
+        <w:tc>
+          <w:tcPr>
+            <w:tcW w:type="dxa" w:w="8640"/>
+            <w:shd w:val="clear" w:color="auto" w:fill="E8F0FE"/>
+          </w:tcPr>
+          <w:p>
+            <w:r>
+              <w:rPr>
+                <w:b/>
+                <w:color w:val="1565C0"/>
+                <w:sz w:val="22"/>
+              </w:rPr>
+              <w:t xml:space="preserve">Q86. </w:t>
+            </w:r>
+            <w:r>
+              <w:rPr>
+                <w:b/>
+                <w:color w:val="12143A"/>
+              </w:rPr>
+              <w:t>Regulations get superseded or amended — how does your system handle that?</w:t>
+            </w:r>
+          </w:p>
+        </w:tc>
+      </w:tr>
+    </w:tbl>
+    <w:p>
+      <w:r>
+        <w:rPr>
+          <w:b/>
+          <w:color w:val="2E7D32"/>
+        </w:rPr>
+        <w:t xml:space="preserve">A. </w:t>
+      </w:r>
+      <w:r>
+        <w:rPr>
+          <w:b w:val="0"/>
+        </w:rPr>
+        <w:t>Right now it answers from the documents as downloaded on a fixed date, and it cites them, so a user can see the source and its recency. Handling supersession properly — flagging that a rule was replaced — is a roadmap item; the corpus would need version metadata and the agent a step to prefer the latest. I'm honest that this is a known limitation.</w:t>
+      </w:r>
+    </w:p>
+    <w:p>
+      <w:pPr>
+        <w:spacing w:after="40"/>
+      </w:pPr>
+    </w:p>
+    <w:tbl>
+      <w:tblPr>
+        <w:tblW w:type="auto" w:w="0"/>
+        <w:tblLook w:firstColumn="1" w:firstRow="1" w:lastColumn="0" w:lastRow="0" w:noHBand="0" w:noVBand="1" w:val="04A0"/>
+      </w:tblPr>
+      <w:tblGrid>
+        <w:gridCol w:w="8640"/>
+      </w:tblGrid>
+      <w:tr>
+        <w:tc>
+          <w:tcPr>
+            <w:tcW w:type="dxa" w:w="8640"/>
+            <w:shd w:val="clear" w:color="auto" w:fill="E8F0FE"/>
+          </w:tcPr>
+          <w:p>
+            <w:r>
+              <w:rPr>
+                <w:b/>
+                <w:color w:val="1565C0"/>
+                <w:sz w:val="22"/>
+              </w:rPr>
+              <w:t xml:space="preserve">Q87. </w:t>
+            </w:r>
+            <w:r>
+              <w:rPr>
+                <w:b/>
+                <w:color w:val="12143A"/>
+              </w:rPr>
+              <w:t>Could this be used to give customers or officers actual compliance decisions?</w:t>
+            </w:r>
+          </w:p>
+        </w:tc>
+      </w:tr>
+    </w:tbl>
+    <w:p>
+      <w:r>
+        <w:rPr>
+          <w:b/>
+          <w:color w:val="2E7D32"/>
+        </w:rPr>
+        <w:t xml:space="preserve">A. </w:t>
+      </w:r>
+      <w:r>
+        <w:rPr>
+          <w:b w:val="0"/>
+        </w:rPr>
+        <w:t>As a decision-support tool that surfaces the right regulation with a citation, yes — but not as the final word. It's not legal advice, the corpus is a focused slice, and a human expert must confirm. I'm careful to frame it as a portfolio demonstration of the pattern, not a certified compliance product.</w:t>
+      </w:r>
+    </w:p>
+    <w:p>
+      <w:pPr>
+        <w:spacing w:after="40"/>
+      </w:pPr>
+    </w:p>
+    <w:tbl>
+      <w:tblPr>
+        <w:tblW w:type="auto" w:w="0"/>
+        <w:tblLook w:firstColumn="1" w:firstRow="1" w:lastColumn="0" w:lastRow="0" w:noHBand="0" w:noVBand="1" w:val="04A0"/>
+      </w:tblPr>
+      <w:tblGrid>
+        <w:gridCol w:w="8640"/>
+      </w:tblGrid>
+      <w:tr>
+        <w:tc>
+          <w:tcPr>
+            <w:tcW w:type="dxa" w:w="8640"/>
+            <w:shd w:val="clear" w:color="auto" w:fill="E8F0FE"/>
+          </w:tcPr>
+          <w:p>
+            <w:r>
+              <w:rPr>
+                <w:b/>
+                <w:color w:val="1565C0"/>
+                <w:sz w:val="22"/>
+              </w:rPr>
+              <w:t xml:space="preserve">Q88. </w:t>
+            </w:r>
+            <w:r>
+              <w:rPr>
+                <w:b/>
+                <w:color w:val="12143A"/>
+              </w:rPr>
+              <w:t>Why did you pick lending/credit as the theme rather than covering all of RBI?</w:t>
+            </w:r>
+          </w:p>
+        </w:tc>
+      </w:tr>
+    </w:tbl>
+    <w:p>
+      <w:r>
+        <w:rPr>
+          <w:b/>
+          <w:color w:val="2E7D32"/>
+        </w:rPr>
+        <w:t xml:space="preserve">A. </w:t>
+      </w:r>
+      <w:r>
+        <w:rPr>
+          <w:b w:val="0"/>
+        </w:rPr>
+        <w:t>Focus beats breadth for a defensible project. A coherent, cross-referencing slice (lending, credit, customer protection) means questions genuinely span multiple related documents — which tests retrieval and citation well — without pretending to cover all of RBI, which would dilute quality and honesty.</w:t>
       </w:r>
     </w:p>
     <w:p>

</xml_diff>